<commit_message>
Update Word discussion of screen-size benefits
</commit_message>
<xml_diff>
--- a/论文对比资料_2026-08-23/09_完整显示设计与数据讨论论文_2026-08-24/行为树论文_Word修改版_完整显示设计与数据讨论_2026-08-24.docx
+++ b/论文对比资料_2026-08-23/09_完整显示设计与数据讨论论文_2026-08-24/行为树论文_Word修改版_完整显示设计与数据讨论_2026-08-24.docx
@@ -3671,6 +3671,12 @@
       </w:r>
     </w:p>
     <w:p>
+      <w:pPr/>
+      <w:r>
+        <w:t>对于 241 节点树，三块屏幕上的 Subtree Focus 覆盖率依次为 82.35%、88.24% 和 88.24%，Context Collapse 为 50.00%、64.29% 和 64.29%。对于 364 节点树，Subtree Focus 依次为 86.05%、95.35% 和 95.35%，Context Collapse 为 36.36%、54.55% 和 54.55%。这些比例表示当前条件保留的卡片中有多少进入画布，不表示完整树有相同比例同时可见。</w:t>
+      </w:r>
+    </w:p>
+    <w:p>
       <w:pPr>
         <w:pStyle w:val="21"/>
       </w:pPr>
@@ -3782,13 +3788,19 @@
     <w:p>
       <w:pPr/>
       <w:r>
-        <w:t>显示优化本身的相对效果没有因为屏幕改变而明显波动。Compact 的面积降低仍为 61.09–61.35%，Overview 仍为 90.27–90.34%。Search 在全部 15 个“屏幕—规模”组合中都把固定目标移入视口。</w:t>
+        <w:t>不同功能对屏幕尺寸的反应并不相同。Compact 在三块屏幕上的卡片面积降低均为 61.09–61.35%，Overview 均为 90.27–90.34%。两者在小屏和大屏上的相对效果几乎相同，因此提供的是不依赖屏幕尺寸的信息密度改进，没有额外放大大屏幕优势。由于 241 和 364 节点树已经达到 0.10 倍的最小缩放，它们虽然明显缩小卡片和信息量，却没有让小屏幕一次显示更多完整树节点。</w:t>
       </w:r>
     </w:p>
     <w:p>
       <w:pPr/>
       <w:r>
-        <w:t>较大屏幕提供更多画布空间；Compact 和 Overview 提高单位空间中的信息密度；Search、Focus 和 Collapse 控制当前需要查看的内容。两组数据共同说明，这些功能能够在不同节点数量和不同物理屏幕尺寸下持续改善可测的显示效果。</w:t>
+        <w:t>Subtree Focus 对小屏幕的补偿最明显。241 节点树在小屏幕上增加 64.04 个覆盖百分点，在大屏幕上增加 41.70 个百分点；小屏与大屏的差距由 28.22 缩小到 5.88 个百分点。364 节点树的小屏增加 73.92 个百分点，大屏增加 64.53 个百分点，屏幕间差距由 18.69 缩小到 9.30 个百分点。Context Collapse 的补偿较弱：241 节点树的屏幕间差距缩小到 14.29 个百分点，364 节点树只缩小到 18.18 个百分点。这里比较的是当前条件保留卡片的覆盖率，不表示完整树已经全部显示。</w:t>
+      </w:r>
+    </w:p>
+    <w:p>
+      <w:pPr/>
+      <w:r>
+        <w:t>Search 在全部 15 个“屏幕—规模”组合中都把固定目标移入视口。综合来看，大屏幕仍能显示更多绝对上下文，但优化没有进一步扩大这种优势。Compact 和 Overview 跨屏幕保持稳定，Search 保持目标可定位，Focus 则明显缩小小屏与大屏的覆盖差距。因此，数据更支持“显示优化补偿了小屏幕的部分空间限制，同时保留大屏幕的绝对容量优势”，而不是“显示优化主要扩大大屏幕优势”。这一结论只针对卡片面积、上下文覆盖和目标定位，不等同于人的可读性或使用效率。</w:t>
       </w:r>
     </w:p>
     <w:p>
@@ -3823,7 +3835,7 @@
     <w:p>
       <w:pPr/>
       <w:r>
-        <w:t>物理屏幕实验表明，大屏幕能够显示更多节点，Compact、Overview 和 Search 在不同屏幕上的作用保持稳定。显示优化改善了部分客观指标，但没有真人数据证明用户理解能力已经提高。</w:t>
+        <w:t>物理屏幕实验表明，大屏幕能够显示更多节点，Compact、Overview 和 Search 在不同屏幕上的作用保持稳定，Focus 则明显缩小了小屏幕与大屏幕的覆盖差距。显示优化改善了部分客观指标，但没有真人数据证明用户理解能力已经提高。</w:t>
       </w:r>
     </w:p>
     <w:p>

</xml_diff>